<commit_message>
Refresh Assignment 2 report with GitHub evidence
</commit_message>
<xml_diff>
--- a/Assignment 2 - Technical Analysis Using R Preliminary Stage/Sunny_Khurana_BDA400_A02.docx
+++ b/Assignment 2 - Technical Analysis Using R Preliminary Stage/Sunny_Khurana_BDA400_A02.docx
@@ -1624,6 +1624,62 @@
     </w:p>
     <w:p>
       <w:pPr>
+        <w:spacing w:before="40" w:after="80"/>
+        <w:jc w:val="center"/>
+      </w:pPr>
+      <w:r>
+        <w:drawing>
+          <wp:inline xmlns:a="http://schemas.openxmlformats.org/drawingml/2006/main" xmlns:pic="http://schemas.openxmlformats.org/drawingml/2006/picture">
+            <wp:extent cx="5897880" cy="9534906"/>
+            <wp:docPr id="1" name="Picture 1" descr="Genuine local R visualization evidence: closing prices and five-day moving averages"/>
+            <wp:cNvGraphicFramePr>
+              <a:graphicFrameLocks noChangeAspect="1"/>
+            </wp:cNvGraphicFramePr>
+            <a:graphic>
+              <a:graphicData uri="http://schemas.openxmlformats.org/drawingml/2006/picture">
+                <pic:pic>
+                  <pic:nvPicPr>
+                    <pic:cNvPr id="0" name="github-technicalanalysis.png"/>
+                    <pic:cNvPicPr/>
+                  </pic:nvPicPr>
+                  <pic:blipFill>
+                    <a:blip r:embed="rId11"/>
+                    <a:stretch>
+                      <a:fillRect/>
+                    </a:stretch>
+                  </pic:blipFill>
+                  <pic:spPr>
+                    <a:xfrm>
+                      <a:off x="0" y="0"/>
+                      <a:ext cx="5897880" cy="9534906"/>
+                    </a:xfrm>
+                    <a:prstGeom prst="rect"/>
+                  </pic:spPr>
+                </pic:pic>
+              </a:graphicData>
+            </a:graphic>
+          </wp:inline>
+        </w:drawing>
+      </w:r>
+    </w:p>
+    <w:p>
+      <w:pPr>
+        <w:spacing w:after="120"/>
+        <w:jc w:val="center"/>
+      </w:pPr>
+      <w:r>
+        <w:rPr>
+          <w:rFonts w:ascii="Calibri" w:hAnsi="Calibri"/>
+          <w:b w:val="0"/>
+          <w:i/>
+          <w:color w:val="5B6770"/>
+          <w:sz w:val="18"/>
+        </w:rPr>
+        <w:t>Figure 1. Genuine GitHub repository evidence captured after the public TechnicalAnalysis assignment folder was uploaded.</w:t>
+      </w:r>
+    </w:p>
+    <w:p>
+      <w:pPr>
         <w:pStyle w:val="Heading1"/>
         <w:keepNext/>
       </w:pPr>
@@ -3131,7 +3187,7 @@
         <w:drawing>
           <wp:inline xmlns:a="http://schemas.openxmlformats.org/drawingml/2006/main" xmlns:pic="http://schemas.openxmlformats.org/drawingml/2006/picture">
             <wp:extent cx="5897880" cy="3440430"/>
-            <wp:docPr id="1" name="Picture 1" descr="Genuine local R visualization evidence: closing prices and five-day moving averages"/>
+            <wp:docPr id="2" name="Picture 2" descr="Genuine local R visualization evidence: closing prices and five-day moving averages"/>
             <wp:cNvGraphicFramePr>
               <a:graphicFrameLocks noChangeAspect="1"/>
             </wp:cNvGraphicFramePr>
@@ -3143,7 +3199,7 @@
                     <pic:cNvPicPr/>
                   </pic:nvPicPr>
                   <pic:blipFill>
-                    <a:blip r:embed="rId11"/>
+                    <a:blip r:embed="rId12"/>
                     <a:stretch>
                       <a:fillRect/>
                     </a:stretch>

</xml_diff>